<commit_message>
To Present Warranty Overview Data Successfully
</commit_message>
<xml_diff>
--- a/document/non-operational-assets.docx
+++ b/document/non-operational-assets.docx
@@ -21,15 +21,7 @@
     </w:p>
     <w:p>
       <w:r>
-        <w:t xml:space="preserve">        </w:t>
-      </w:r>
-      <w:proofErr w:type="gramStart"/>
-      <w:r>
-        <w:t>ad.device</w:t>
-      </w:r>
-      <w:proofErr w:type="gramEnd"/>
-      <w:r>
-        <w:t>_serial,</w:t>
+        <w:t xml:space="preserve">        ad.device_serial,</w:t>
       </w:r>
     </w:p>
     <w:p>
@@ -44,75 +36,33 @@
     </w:p>
     <w:p>
       <w:r>
-        <w:t xml:space="preserve">        </w:t>
-      </w:r>
-      <w:proofErr w:type="gramStart"/>
-      <w:r>
-        <w:t>ad.department</w:t>
-      </w:r>
-      <w:proofErr w:type="gramEnd"/>
-      <w:r>
-        <w:t xml:space="preserve"> AS current_department,</w:t>
-      </w:r>
-    </w:p>
-    <w:p>
-      <w:r>
-        <w:t xml:space="preserve">        </w:t>
-      </w:r>
-      <w:proofErr w:type="gramStart"/>
-      <w:r>
-        <w:t>ad.designation</w:t>
-      </w:r>
-      <w:proofErr w:type="gramEnd"/>
-      <w:r>
-        <w:t xml:space="preserve"> AS current_designation,</w:t>
-      </w:r>
-    </w:p>
-    <w:p/>
-    <w:p>
-      <w:r>
-        <w:t xml:space="preserve">        </w:t>
-      </w:r>
-      <w:proofErr w:type="gramStart"/>
-      <w:r>
-        <w:t>UPPER(</w:t>
-      </w:r>
-      <w:proofErr w:type="gramEnd"/>
-    </w:p>
-    <w:p>
-      <w:r>
-        <w:t xml:space="preserve">            REGEXP_</w:t>
-      </w:r>
-      <w:proofErr w:type="gramStart"/>
-      <w:r>
-        <w:t>REPLACE(</w:t>
-      </w:r>
-      <w:proofErr w:type="gramEnd"/>
-    </w:p>
-    <w:p>
-      <w:r>
-        <w:t xml:space="preserve">                </w:t>
-      </w:r>
-      <w:proofErr w:type="gramStart"/>
-      <w:r>
-        <w:t>BTRIM(ad.device</w:t>
-      </w:r>
-      <w:proofErr w:type="gramEnd"/>
-      <w:r>
-        <w:t>_serial),</w:t>
-      </w:r>
-    </w:p>
-    <w:p>
-      <w:r>
-        <w:t xml:space="preserve">                '[^A-Za-z0-</w:t>
-      </w:r>
-      <w:proofErr w:type="gramStart"/>
-      <w:r>
-        <w:t>9]+</w:t>
-      </w:r>
-      <w:proofErr w:type="gramEnd"/>
-      <w:r>
-        <w:t>',</w:t>
+        <w:t xml:space="preserve">        ad.department AS current_department,</w:t>
+      </w:r>
+    </w:p>
+    <w:p>
+      <w:r>
+        <w:t xml:space="preserve">        ad.designation AS current_designation,</w:t>
+      </w:r>
+    </w:p>
+    <w:p/>
+    <w:p>
+      <w:r>
+        <w:t xml:space="preserve">        UPPER(</w:t>
+      </w:r>
+    </w:p>
+    <w:p>
+      <w:r>
+        <w:t xml:space="preserve">            REGEXP_REPLACE(</w:t>
+      </w:r>
+    </w:p>
+    <w:p>
+      <w:r>
+        <w:t xml:space="preserve">                BTRIM(ad.device_serial),</w:t>
+      </w:r>
+    </w:p>
+    <w:p>
+      <w:r>
+        <w:t xml:space="preserve">                '[^A-Za-z0-9]+',</w:t>
       </w:r>
     </w:p>
     <w:p>
@@ -137,28 +87,12 @@
     </w:p>
     <w:p>
       <w:r>
-        <w:t xml:space="preserve">    FROM </w:t>
-      </w:r>
-      <w:proofErr w:type="gramStart"/>
-      <w:r>
-        <w:t>public.asset</w:t>
-      </w:r>
-      <w:proofErr w:type="gramEnd"/>
-      <w:r>
-        <w:t>_devices ad</w:t>
-      </w:r>
-    </w:p>
-    <w:p>
-      <w:r>
-        <w:t xml:space="preserve">    WHERE </w:t>
-      </w:r>
-      <w:proofErr w:type="gramStart"/>
-      <w:r>
-        <w:t>ad.asset</w:t>
-      </w:r>
-      <w:proofErr w:type="gramEnd"/>
-      <w:r>
-        <w:t>_status = 2</w:t>
+        <w:t xml:space="preserve">    FROM public.asset_devices ad</w:t>
+      </w:r>
+    </w:p>
+    <w:p>
+      <w:r>
+        <w:t xml:space="preserve">    WHERE ad.asset_status = 2</w:t>
       </w:r>
     </w:p>
     <w:p>
@@ -168,15 +102,7 @@
     </w:p>
     <w:p>
       <w:r>
-        <w:t xml:space="preserve">      AND NULLIF(</w:t>
-      </w:r>
-      <w:proofErr w:type="gramStart"/>
-      <w:r>
-        <w:t>BTRIM(ad.device</w:t>
-      </w:r>
-      <w:proofErr w:type="gramEnd"/>
-      <w:r>
-        <w:t>_serial), '') IS NOT NULL</w:t>
+        <w:t xml:space="preserve">      AND NULLIF(BTRIM(ad.device_serial), '') IS NOT NULL</w:t>
       </w:r>
     </w:p>
     <w:p>
@@ -234,48 +160,22 @@
     <w:p/>
     <w:p>
       <w:r>
-        <w:t xml:space="preserve">        </w:t>
-      </w:r>
-      <w:proofErr w:type="gramStart"/>
-      <w:r>
-        <w:t>UPPER(</w:t>
-      </w:r>
-      <w:proofErr w:type="gramEnd"/>
-    </w:p>
-    <w:p>
-      <w:r>
-        <w:t xml:space="preserve">            REGEXP_</w:t>
-      </w:r>
-      <w:proofErr w:type="gramStart"/>
-      <w:r>
-        <w:t>REPLACE(</w:t>
-      </w:r>
-      <w:proofErr w:type="gramEnd"/>
-    </w:p>
-    <w:p>
-      <w:r>
-        <w:t xml:space="preserve">                BTRIM(</w:t>
-      </w:r>
-      <w:proofErr w:type="gramStart"/>
-      <w:r>
-        <w:t>l.device</w:t>
-      </w:r>
-      <w:proofErr w:type="gramEnd"/>
-      <w:r>
-        <w:t>_serial),</w:t>
-      </w:r>
-    </w:p>
-    <w:p>
-      <w:r>
-        <w:t xml:space="preserve">                '[^A-Za-z0-</w:t>
-      </w:r>
-      <w:proofErr w:type="gramStart"/>
-      <w:r>
-        <w:t>9]+</w:t>
-      </w:r>
-      <w:proofErr w:type="gramEnd"/>
-      <w:r>
-        <w:t>',</w:t>
+        <w:t xml:space="preserve">        UPPER(</w:t>
+      </w:r>
+    </w:p>
+    <w:p>
+      <w:r>
+        <w:t xml:space="preserve">            REGEXP_REPLACE(</w:t>
+      </w:r>
+    </w:p>
+    <w:p>
+      <w:r>
+        <w:t xml:space="preserve">                BTRIM(l.device_serial),</w:t>
+      </w:r>
+    </w:p>
+    <w:p>
+      <w:r>
+        <w:t xml:space="preserve">                '[^A-Za-z0-9]+',</w:t>
       </w:r>
     </w:p>
     <w:p>
@@ -300,41 +200,17 @@
     </w:p>
     <w:p>
       <w:r>
-        <w:t xml:space="preserve">    FROM </w:t>
-      </w:r>
-      <w:proofErr w:type="gramStart"/>
-      <w:r>
-        <w:t>public.legacy</w:t>
-      </w:r>
-      <w:proofErr w:type="gramEnd"/>
-      <w:r>
-        <w:t>_damaged_requisition_forms l</w:t>
-      </w:r>
-    </w:p>
-    <w:p>
-      <w:r>
-        <w:t xml:space="preserve">    WHERE </w:t>
-      </w:r>
-      <w:proofErr w:type="gramStart"/>
-      <w:r>
-        <w:t>l.legacy</w:t>
-      </w:r>
-      <w:proofErr w:type="gramEnd"/>
-      <w:r>
-        <w:t>_status = '0'</w:t>
-      </w:r>
-    </w:p>
-    <w:p>
-      <w:r>
-        <w:t xml:space="preserve">      AND NULLIF(BTRIM(</w:t>
-      </w:r>
-      <w:proofErr w:type="gramStart"/>
-      <w:r>
-        <w:t>l.device</w:t>
-      </w:r>
-      <w:proofErr w:type="gramEnd"/>
-      <w:r>
-        <w:t>_serial), '') IS NOT NULL</w:t>
+        <w:t xml:space="preserve">    FROM public.legacy_damaged_requisition_forms l</w:t>
+      </w:r>
+    </w:p>
+    <w:p>
+      <w:r>
+        <w:t xml:space="preserve">    WHERE l.legacy_status = '0'</w:t>
+      </w:r>
+    </w:p>
+    <w:p>
+      <w:r>
+        <w:t xml:space="preserve">      AND NULLIF(BTRIM(l.device_serial), '') IS NOT NULL</w:t>
       </w:r>
     </w:p>
     <w:p>
@@ -398,80 +274,32 @@
     <w:p/>
     <w:p>
       <w:r>
-        <w:t xml:space="preserve">    </w:t>
-      </w:r>
-      <w:proofErr w:type="gramStart"/>
-      <w:r>
-        <w:t>p.legacy</w:t>
-      </w:r>
-      <w:proofErr w:type="gramEnd"/>
-      <w:r>
-        <w:t>_form_id,</w:t>
-      </w:r>
-    </w:p>
-    <w:p>
-      <w:r>
-        <w:t xml:space="preserve">    </w:t>
-      </w:r>
-      <w:proofErr w:type="gramStart"/>
-      <w:r>
-        <w:t>p.previous</w:t>
-      </w:r>
-      <w:proofErr w:type="gramEnd"/>
-      <w:r>
-        <w:t>_emp_id,</w:t>
-      </w:r>
-    </w:p>
-    <w:p>
-      <w:r>
-        <w:t xml:space="preserve">    </w:t>
-      </w:r>
-      <w:proofErr w:type="gramStart"/>
-      <w:r>
-        <w:t>p.previous</w:t>
-      </w:r>
-      <w:proofErr w:type="gramEnd"/>
-      <w:r>
-        <w:t>_emp_name,</w:t>
-      </w:r>
-    </w:p>
-    <w:p>
-      <w:r>
-        <w:t xml:space="preserve">    </w:t>
-      </w:r>
-      <w:proofErr w:type="gramStart"/>
-      <w:r>
-        <w:t>p.previous</w:t>
-      </w:r>
-      <w:proofErr w:type="gramEnd"/>
-      <w:r>
-        <w:t>_department,</w:t>
-      </w:r>
-    </w:p>
-    <w:p>
-      <w:r>
-        <w:t xml:space="preserve">    </w:t>
-      </w:r>
-      <w:proofErr w:type="gramStart"/>
-      <w:r>
-        <w:t>p.previous</w:t>
-      </w:r>
-      <w:proofErr w:type="gramEnd"/>
-      <w:r>
-        <w:t>_designation,</w:t>
-      </w:r>
-    </w:p>
-    <w:p>
-      <w:r>
-        <w:t xml:space="preserve">    </w:t>
-      </w:r>
-      <w:proofErr w:type="gramStart"/>
-      <w:r>
-        <w:t>p.previous</w:t>
-      </w:r>
-      <w:proofErr w:type="gramEnd"/>
-      <w:r>
-        <w:t>_user_name,</w:t>
+        <w:t xml:space="preserve">    p.legacy_form_id,</w:t>
+      </w:r>
+    </w:p>
+    <w:p>
+      <w:r>
+        <w:t xml:space="preserve">    p.previous_emp_id,</w:t>
+      </w:r>
+    </w:p>
+    <w:p>
+      <w:r>
+        <w:t xml:space="preserve">    p.previous_emp_name,</w:t>
+      </w:r>
+    </w:p>
+    <w:p>
+      <w:r>
+        <w:t xml:space="preserve">    p.previous_department,</w:t>
+      </w:r>
+    </w:p>
+    <w:p>
+      <w:r>
+        <w:t xml:space="preserve">    p.previous_designation,</w:t>
+      </w:r>
+    </w:p>
+    <w:p>
+      <w:r>
+        <w:t xml:space="preserve">    p.previous_user_name,</w:t>
       </w:r>
     </w:p>
     <w:p/>
@@ -482,120 +310,48 @@
     </w:p>
     <w:p>
       <w:r>
-        <w:t xml:space="preserve">        WHEN </w:t>
-      </w:r>
-      <w:proofErr w:type="gramStart"/>
-      <w:r>
-        <w:t>p.legacy</w:t>
-      </w:r>
-      <w:proofErr w:type="gramEnd"/>
-      <w:r>
-        <w:t>_form_id IS NULL THEN 'no_previous_damaged_match'</w:t>
-      </w:r>
-    </w:p>
-    <w:p/>
-    <w:p>
-      <w:r>
-        <w:t xml:space="preserve">        WHEN </w:t>
-      </w:r>
-      <w:proofErr w:type="gramStart"/>
-      <w:r>
-        <w:t>COALESCE(c.current</w:t>
-      </w:r>
-      <w:proofErr w:type="gramEnd"/>
-      <w:r>
-        <w:t>_emp_id, '') =</w:t>
-      </w:r>
-    </w:p>
-    <w:p>
-      <w:r>
-        <w:t xml:space="preserve">             </w:t>
-      </w:r>
-      <w:proofErr w:type="gramStart"/>
-      <w:r>
-        <w:t>COALESCE(p.previous</w:t>
-      </w:r>
-      <w:proofErr w:type="gramEnd"/>
-      <w:r>
-        <w:t>_emp_id, '')</w:t>
-      </w:r>
-    </w:p>
-    <w:p>
-      <w:r>
-        <w:t xml:space="preserve">         AND </w:t>
-      </w:r>
-      <w:proofErr w:type="gramStart"/>
-      <w:r>
-        <w:t>COALESCE(c.current</w:t>
-      </w:r>
-      <w:proofErr w:type="gramEnd"/>
-      <w:r>
-        <w:t>_emp_name, '') =</w:t>
-      </w:r>
-    </w:p>
-    <w:p>
-      <w:r>
-        <w:t xml:space="preserve">             </w:t>
-      </w:r>
-      <w:proofErr w:type="gramStart"/>
-      <w:r>
-        <w:t>COALESCE(p.previous</w:t>
-      </w:r>
-      <w:proofErr w:type="gramEnd"/>
-      <w:r>
-        <w:t>_emp_name, '')</w:t>
-      </w:r>
-    </w:p>
-    <w:p>
-      <w:r>
-        <w:t xml:space="preserve">         AND </w:t>
-      </w:r>
-      <w:proofErr w:type="gramStart"/>
-      <w:r>
-        <w:t>COALESCE(c.current</w:t>
-      </w:r>
-      <w:proofErr w:type="gramEnd"/>
-      <w:r>
-        <w:t>_department, '') =</w:t>
-      </w:r>
-    </w:p>
-    <w:p>
-      <w:r>
-        <w:t xml:space="preserve">             </w:t>
-      </w:r>
-      <w:proofErr w:type="gramStart"/>
-      <w:r>
-        <w:t>COALESCE(p.previous</w:t>
-      </w:r>
-      <w:proofErr w:type="gramEnd"/>
-      <w:r>
-        <w:t>_department, '')</w:t>
-      </w:r>
-    </w:p>
-    <w:p>
-      <w:r>
-        <w:t xml:space="preserve">         AND </w:t>
-      </w:r>
-      <w:proofErr w:type="gramStart"/>
-      <w:r>
-        <w:t>COALESCE(c.current</w:t>
-      </w:r>
-      <w:proofErr w:type="gramEnd"/>
-      <w:r>
-        <w:t>_designation, '') =</w:t>
-      </w:r>
-    </w:p>
-    <w:p>
-      <w:r>
-        <w:t xml:space="preserve">             </w:t>
-      </w:r>
-      <w:proofErr w:type="gramStart"/>
-      <w:r>
-        <w:t>COALESCE(p.previous</w:t>
-      </w:r>
-      <w:proofErr w:type="gramEnd"/>
-      <w:r>
-        <w:t>_designation, '')</w:t>
+        <w:t xml:space="preserve">        WHEN p.legacy_form_id IS NULL THEN 'no_previous_damaged_match'</w:t>
+      </w:r>
+    </w:p>
+    <w:p/>
+    <w:p>
+      <w:r>
+        <w:t xml:space="preserve">        WHEN COALESCE(c.current_emp_id, '') =</w:t>
+      </w:r>
+    </w:p>
+    <w:p>
+      <w:r>
+        <w:t xml:space="preserve">             COALESCE(p.previous_emp_id, '')</w:t>
+      </w:r>
+    </w:p>
+    <w:p>
+      <w:r>
+        <w:t xml:space="preserve">         AND COALESCE(c.current_emp_name, '') =</w:t>
+      </w:r>
+    </w:p>
+    <w:p>
+      <w:r>
+        <w:t xml:space="preserve">             COALESCE(p.previous_emp_name, '')</w:t>
+      </w:r>
+    </w:p>
+    <w:p>
+      <w:r>
+        <w:t xml:space="preserve">         AND COALESCE(c.current_department, '') =</w:t>
+      </w:r>
+    </w:p>
+    <w:p>
+      <w:r>
+        <w:t xml:space="preserve">             COALESCE(p.previous_department, '')</w:t>
+      </w:r>
+    </w:p>
+    <w:p>
+      <w:r>
+        <w:t xml:space="preserve">         AND COALESCE(c.current_designation, '') =</w:t>
+      </w:r>
+    </w:p>
+    <w:p>
+      <w:r>
+        <w:t xml:space="preserve">             COALESCE(p.previous_designation, '')</w:t>
       </w:r>
     </w:p>
     <w:p>
@@ -628,23 +384,7 @@
     </w:p>
     <w:p>
       <w:r>
-        <w:t xml:space="preserve">    ON </w:t>
-      </w:r>
-      <w:proofErr w:type="gramStart"/>
-      <w:r>
-        <w:t>p.normalized</w:t>
-      </w:r>
-      <w:proofErr w:type="gramEnd"/>
-      <w:r>
-        <w:t xml:space="preserve">_serial = </w:t>
-      </w:r>
-      <w:proofErr w:type="gramStart"/>
-      <w:r>
-        <w:t>c.normalized</w:t>
-      </w:r>
-      <w:proofErr w:type="gramEnd"/>
-      <w:r>
-        <w:t>_serial</w:t>
+        <w:t xml:space="preserve">    ON p.normalized_serial = c.normalized_serial</w:t>
       </w:r>
     </w:p>
     <w:p/>
@@ -667,6 +407,9 @@
     <w:p/>
     <w:p>
       <w:r>
+        <w:rPr>
+          <w:noProof/>
+        </w:rPr>
         <w:drawing>
           <wp:inline distT="0" distB="0" distL="0" distR="0" wp14:anchorId="4377165F" wp14:editId="120E88C5">
             <wp:extent cx="5943600" cy="3201035"/>
@@ -706,6 +449,9 @@
     </w:p>
     <w:p>
       <w:r>
+        <w:rPr>
+          <w:noProof/>
+        </w:rPr>
         <w:lastRenderedPageBreak/>
         <w:drawing>
           <wp:inline distT="0" distB="0" distL="0" distR="0" wp14:anchorId="5E6DAFA9" wp14:editId="1F0BFBB9">
@@ -762,6 +508,9 @@
     <w:p/>
     <w:p>
       <w:r>
+        <w:rPr>
+          <w:noProof/>
+        </w:rPr>
         <w:lastRenderedPageBreak/>
         <w:drawing>
           <wp:inline distT="0" distB="0" distL="0" distR="0" wp14:anchorId="3BA29FCF" wp14:editId="1D56B695">
@@ -803,19 +552,16 @@
     <w:p/>
     <w:p>
       <w:r>
-        <w:t>SELECT *</w:t>
-      </w:r>
-      <w:r>
-        <w:t xml:space="preserve"> </w:t>
-      </w:r>
-      <w:r>
-        <w:t>FROM public.stg_legacy_damaged_requisition_forms;</w:t>
-      </w:r>
-    </w:p>
-    <w:p/>
-    <w:p/>
-    <w:p>
-      <w:r>
+        <w:t>SELECT * FROM public.stg_legacy_damaged_requisition_forms;</w:t>
+      </w:r>
+    </w:p>
+    <w:p/>
+    <w:p/>
+    <w:p>
+      <w:r>
+        <w:rPr>
+          <w:noProof/>
+        </w:rPr>
         <w:drawing>
           <wp:inline distT="0" distB="0" distL="0" distR="0" wp14:anchorId="780AFDE0" wp14:editId="7E692C8A">
             <wp:extent cx="5943600" cy="3162300"/>
@@ -936,41 +682,17 @@
     </w:p>
     <w:p>
       <w:r>
-        <w:t xml:space="preserve">    </w:t>
-      </w:r>
-      <w:proofErr w:type="gramStart"/>
-      <w:r>
-        <w:t>COUNT(</w:t>
-      </w:r>
-      <w:proofErr w:type="gramEnd"/>
-      <w:r>
-        <w:t>*) AS imported_rows,</w:t>
-      </w:r>
-    </w:p>
-    <w:p>
-      <w:r>
-        <w:t xml:space="preserve">    </w:t>
-      </w:r>
-      <w:proofErr w:type="gramStart"/>
-      <w:r>
-        <w:t>COUNT(</w:t>
-      </w:r>
-      <w:proofErr w:type="gramEnd"/>
-      <w:r>
-        <w:t>*) FILTER (</w:t>
-      </w:r>
-    </w:p>
-    <w:p>
-      <w:r>
-        <w:t xml:space="preserve">        WHERE NULLIF(</w:t>
-      </w:r>
-      <w:proofErr w:type="gramStart"/>
-      <w:r>
-        <w:t>BTRIM(</w:t>
-      </w:r>
-      <w:proofErr w:type="gramEnd"/>
-      <w:r>
-        <w:t>device_s_or_n), '') IS NOT NULL</w:t>
+        <w:t xml:space="preserve">    COUNT(*) AS imported_rows,</w:t>
+      </w:r>
+    </w:p>
+    <w:p>
+      <w:r>
+        <w:t xml:space="preserve">    COUNT(*) FILTER (</w:t>
+      </w:r>
+    </w:p>
+    <w:p>
+      <w:r>
+        <w:t xml:space="preserve">        WHERE NULLIF(BTRIM(device_s_or_n), '') IS NOT NULL</w:t>
       </w:r>
     </w:p>
     <w:p>
@@ -980,28 +702,12 @@
     </w:p>
     <w:p>
       <w:r>
-        <w:t xml:space="preserve">    </w:t>
-      </w:r>
-      <w:proofErr w:type="gramStart"/>
-      <w:r>
-        <w:t>COUNT(</w:t>
-      </w:r>
-      <w:proofErr w:type="gramEnd"/>
-      <w:r>
-        <w:t>*) FILTER (</w:t>
-      </w:r>
-    </w:p>
-    <w:p>
-      <w:r>
-        <w:t xml:space="preserve">        WHERE NULLIF(</w:t>
-      </w:r>
-      <w:proofErr w:type="gramStart"/>
-      <w:r>
-        <w:t>BTRIM(</w:t>
-      </w:r>
-      <w:proofErr w:type="gramEnd"/>
-      <w:r>
-        <w:t>emp_id), '') IS NOT NULL</w:t>
+        <w:t xml:space="preserve">    COUNT(*) FILTER (</w:t>
+      </w:r>
+    </w:p>
+    <w:p>
+      <w:r>
+        <w:t xml:space="preserve">        WHERE NULLIF(BTRIM(emp_id), '') IS NOT NULL</w:t>
       </w:r>
     </w:p>
     <w:p>
@@ -1017,6 +723,9 @@
     <w:p/>
     <w:p>
       <w:r>
+        <w:rPr>
+          <w:noProof/>
+        </w:rPr>
         <w:drawing>
           <wp:inline distT="0" distB="0" distL="0" distR="0" wp14:anchorId="0AB6DE40" wp14:editId="4846985B">
             <wp:extent cx="5943600" cy="3150235"/>
@@ -1123,6 +832,9 @@
     <w:p/>
     <w:p>
       <w:r>
+        <w:rPr>
+          <w:noProof/>
+        </w:rPr>
         <w:drawing>
           <wp:inline distT="0" distB="0" distL="0" distR="0" wp14:anchorId="346D6DB4" wp14:editId="6F90268F">
             <wp:extent cx="5943600" cy="3170555"/>
@@ -1210,28 +922,12 @@
     </w:p>
     <w:p>
       <w:r>
-        <w:t xml:space="preserve">FROM </w:t>
-      </w:r>
-      <w:proofErr w:type="gramStart"/>
-      <w:r>
-        <w:t>public.legacy</w:t>
-      </w:r>
-      <w:proofErr w:type="gramEnd"/>
-      <w:r>
-        <w:t>_damaged_requisition_forms</w:t>
-      </w:r>
-    </w:p>
-    <w:p>
-      <w:r>
-        <w:t xml:space="preserve">WHERE </w:t>
-      </w:r>
-      <w:proofErr w:type="gramStart"/>
-      <w:r>
-        <w:t>BTRIM(COALESCE(</w:t>
-      </w:r>
-      <w:proofErr w:type="gramEnd"/>
-      <w:r>
-        <w:t>legacy_status, '')) = '0'</w:t>
+        <w:t>FROM public.legacy_damaged_requisition_forms</w:t>
+      </w:r>
+    </w:p>
+    <w:p>
+      <w:r>
+        <w:t>WHERE BTRIM(COALESCE(legacy_status, '')) = '0'</w:t>
       </w:r>
     </w:p>
     <w:p>
@@ -1248,6 +944,9 @@
     <w:p/>
     <w:p>
       <w:r>
+        <w:rPr>
+          <w:noProof/>
+        </w:rPr>
         <w:lastRenderedPageBreak/>
         <w:drawing>
           <wp:inline distT="0" distB="0" distL="0" distR="0" wp14:anchorId="6C8708F0" wp14:editId="33BF8A05">
@@ -1337,49 +1036,23 @@
     <w:p/>
     <w:p>
       <w:r>
-        <w:t xml:space="preserve">        </w:t>
-      </w:r>
-      <w:proofErr w:type="gramStart"/>
-      <w:r>
-        <w:t>UPPER(</w:t>
-      </w:r>
-      <w:proofErr w:type="gramEnd"/>
-    </w:p>
-    <w:p>
-      <w:r>
-        <w:t xml:space="preserve">            REGEXP_</w:t>
-      </w:r>
-      <w:proofErr w:type="gramStart"/>
-      <w:r>
-        <w:t>REPLACE(</w:t>
-      </w:r>
-      <w:proofErr w:type="gramEnd"/>
+        <w:t xml:space="preserve">        UPPER(</w:t>
+      </w:r>
+    </w:p>
+    <w:p>
+      <w:r>
+        <w:t xml:space="preserve">            REGEXP_REPLACE(</w:t>
+      </w:r>
     </w:p>
     <w:p>
       <w:r>
         <w:lastRenderedPageBreak/>
-        <w:t xml:space="preserve">                BTRIM(</w:t>
-      </w:r>
-      <w:proofErr w:type="gramStart"/>
-      <w:r>
-        <w:t>l.device</w:t>
-      </w:r>
-      <w:proofErr w:type="gramEnd"/>
-      <w:r>
-        <w:t>_serial),</w:t>
-      </w:r>
-    </w:p>
-    <w:p>
-      <w:r>
-        <w:t xml:space="preserve">                '[^A-Za-z0-</w:t>
-      </w:r>
-      <w:proofErr w:type="gramStart"/>
-      <w:r>
-        <w:t>9]+</w:t>
-      </w:r>
-      <w:proofErr w:type="gramEnd"/>
-      <w:r>
-        <w:t>',</w:t>
+        <w:t xml:space="preserve">                BTRIM(l.device_serial),</w:t>
+      </w:r>
+    </w:p>
+    <w:p>
+      <w:r>
+        <w:t xml:space="preserve">                '[^A-Za-z0-9]+',</w:t>
       </w:r>
     </w:p>
     <w:p>
@@ -1405,41 +1078,17 @@
     <w:p/>
     <w:p>
       <w:r>
-        <w:t xml:space="preserve">    FROM </w:t>
-      </w:r>
-      <w:proofErr w:type="gramStart"/>
-      <w:r>
-        <w:t>public.legacy</w:t>
-      </w:r>
-      <w:proofErr w:type="gramEnd"/>
-      <w:r>
-        <w:t>_damaged_requisition_forms l</w:t>
-      </w:r>
-    </w:p>
-    <w:p>
-      <w:r>
-        <w:t xml:space="preserve">    WHERE </w:t>
-      </w:r>
-      <w:proofErr w:type="gramStart"/>
-      <w:r>
-        <w:t>BTRIM(COALESCE(l.legacy</w:t>
-      </w:r>
-      <w:proofErr w:type="gramEnd"/>
-      <w:r>
-        <w:t>_status, '')) = '0'</w:t>
-      </w:r>
-    </w:p>
-    <w:p>
-      <w:r>
-        <w:t xml:space="preserve">      AND NULLIF(BTRIM(</w:t>
-      </w:r>
-      <w:proofErr w:type="gramStart"/>
-      <w:r>
-        <w:t>l.device</w:t>
-      </w:r>
-      <w:proofErr w:type="gramEnd"/>
-      <w:r>
-        <w:t>_serial), '') IS NOT NULL</w:t>
+        <w:t xml:space="preserve">    FROM public.legacy_damaged_requisition_forms l</w:t>
+      </w:r>
+    </w:p>
+    <w:p>
+      <w:r>
+        <w:t xml:space="preserve">    WHERE BTRIM(COALESCE(l.legacy_status, '')) = '0'</w:t>
+      </w:r>
+    </w:p>
+    <w:p>
+      <w:r>
+        <w:t xml:space="preserve">      AND NULLIF(BTRIM(l.device_serial), '') IS NOT NULL</w:t>
       </w:r>
     </w:p>
     <w:p/>
@@ -1543,43 +1192,19 @@
     </w:p>
     <w:p>
       <w:r>
-        <w:t xml:space="preserve">    </w:t>
-      </w:r>
-      <w:proofErr w:type="gramStart"/>
-      <w:r>
-        <w:t>COUNT(</w:t>
-      </w:r>
-      <w:proofErr w:type="gramEnd"/>
-      <w:r>
-        <w:t>*) AS valid_previous_damaged_devices,</w:t>
-      </w:r>
-    </w:p>
-    <w:p/>
-    <w:p>
-      <w:r>
-        <w:t xml:space="preserve">    </w:t>
-      </w:r>
-      <w:proofErr w:type="gramStart"/>
-      <w:r>
-        <w:t>COUNT(</w:t>
-      </w:r>
-      <w:proofErr w:type="gramEnd"/>
-      <w:r>
-        <w:t>ad.id) AS already_exists_in_asset_devices,</w:t>
-      </w:r>
-    </w:p>
-    <w:p/>
-    <w:p>
-      <w:r>
-        <w:t xml:space="preserve">    </w:t>
-      </w:r>
-      <w:proofErr w:type="gramStart"/>
-      <w:r>
-        <w:t>COUNT(</w:t>
-      </w:r>
-      <w:proofErr w:type="gramEnd"/>
-      <w:r>
-        <w:t>*) FILTER (</w:t>
+        <w:t xml:space="preserve">    COUNT(*) AS valid_previous_damaged_devices,</w:t>
+      </w:r>
+    </w:p>
+    <w:p/>
+    <w:p>
+      <w:r>
+        <w:t xml:space="preserve">    COUNT(ad.id) AS already_exists_in_asset_devices,</w:t>
+      </w:r>
+    </w:p>
+    <w:p/>
+    <w:p>
+      <w:r>
+        <w:t xml:space="preserve">    COUNT(*) FILTER (</w:t>
       </w:r>
     </w:p>
     <w:p>
@@ -1600,48 +1225,27 @@
     </w:p>
     <w:p>
       <w:r>
-        <w:t xml:space="preserve">LEFT JOIN </w:t>
-      </w:r>
-      <w:proofErr w:type="gramStart"/>
-      <w:r>
-        <w:t>public.asset</w:t>
-      </w:r>
-      <w:proofErr w:type="gramEnd"/>
-      <w:r>
-        <w:t>_devices ad</w:t>
-      </w:r>
-    </w:p>
-    <w:p>
-      <w:r>
-        <w:t xml:space="preserve">    ON </w:t>
-      </w:r>
-      <w:proofErr w:type="gramStart"/>
-      <w:r>
-        <w:t>ad.device</w:t>
-      </w:r>
-      <w:proofErr w:type="gramEnd"/>
-      <w:r>
-        <w:t xml:space="preserve">_serial_key = </w:t>
-      </w:r>
-      <w:proofErr w:type="gramStart"/>
-      <w:r>
-        <w:t>l.normalized</w:t>
-      </w:r>
-      <w:proofErr w:type="gramEnd"/>
-      <w:r>
-        <w:t>_serial;</w:t>
-      </w:r>
-    </w:p>
-    <w:p/>
-    <w:p/>
-    <w:p/>
-    <w:p/>
-    <w:p/>
-    <w:p/>
-    <w:p/>
-    <w:p/>
-    <w:p>
-      <w:r>
+        <w:t>LEFT JOIN public.asset_devices ad</w:t>
+      </w:r>
+    </w:p>
+    <w:p>
+      <w:r>
+        <w:t xml:space="preserve">    ON ad.device_serial_key = l.normalized_serial;</w:t>
+      </w:r>
+    </w:p>
+    <w:p/>
+    <w:p/>
+    <w:p/>
+    <w:p/>
+    <w:p/>
+    <w:p/>
+    <w:p/>
+    <w:p/>
+    <w:p>
+      <w:r>
+        <w:rPr>
+          <w:noProof/>
+        </w:rPr>
         <w:lastRenderedPageBreak/>
         <w:drawing>
           <wp:inline distT="0" distB="0" distL="0" distR="0" wp14:anchorId="22DA310F" wp14:editId="5D0A3383">
@@ -1729,48 +1333,22 @@
     <w:p/>
     <w:p>
       <w:r>
-        <w:t xml:space="preserve">        </w:t>
-      </w:r>
-      <w:proofErr w:type="gramStart"/>
-      <w:r>
-        <w:t>UPPER(</w:t>
-      </w:r>
-      <w:proofErr w:type="gramEnd"/>
-    </w:p>
-    <w:p>
-      <w:r>
-        <w:t xml:space="preserve">            REGEXP_</w:t>
-      </w:r>
-      <w:proofErr w:type="gramStart"/>
-      <w:r>
-        <w:t>REPLACE(</w:t>
-      </w:r>
-      <w:proofErr w:type="gramEnd"/>
-    </w:p>
-    <w:p>
-      <w:r>
-        <w:t xml:space="preserve">                BTRIM(</w:t>
-      </w:r>
-      <w:proofErr w:type="gramStart"/>
-      <w:r>
-        <w:t>l.device</w:t>
-      </w:r>
-      <w:proofErr w:type="gramEnd"/>
-      <w:r>
-        <w:t>_serial),</w:t>
-      </w:r>
-    </w:p>
-    <w:p>
-      <w:r>
-        <w:t xml:space="preserve">                '[^A-Za-z0-</w:t>
-      </w:r>
-      <w:proofErr w:type="gramStart"/>
-      <w:r>
-        <w:t>9]+</w:t>
-      </w:r>
-      <w:proofErr w:type="gramEnd"/>
-      <w:r>
-        <w:t>',</w:t>
+        <w:t xml:space="preserve">        UPPER(</w:t>
+      </w:r>
+    </w:p>
+    <w:p>
+      <w:r>
+        <w:t xml:space="preserve">            REGEXP_REPLACE(</w:t>
+      </w:r>
+    </w:p>
+    <w:p>
+      <w:r>
+        <w:t xml:space="preserve">                BTRIM(l.device_serial),</w:t>
+      </w:r>
+    </w:p>
+    <w:p>
+      <w:r>
+        <w:t xml:space="preserve">                '[^A-Za-z0-9]+',</w:t>
       </w:r>
     </w:p>
     <w:p>
@@ -1797,41 +1375,17 @@
     <w:p/>
     <w:p>
       <w:r>
-        <w:t xml:space="preserve">    FROM </w:t>
-      </w:r>
-      <w:proofErr w:type="gramStart"/>
-      <w:r>
-        <w:t>public.legacy</w:t>
-      </w:r>
-      <w:proofErr w:type="gramEnd"/>
-      <w:r>
-        <w:t>_damaged_requisition_forms l</w:t>
-      </w:r>
-    </w:p>
-    <w:p>
-      <w:r>
-        <w:t xml:space="preserve">    WHERE </w:t>
-      </w:r>
-      <w:proofErr w:type="gramStart"/>
-      <w:r>
-        <w:t>BTRIM(COALESCE(l.legacy</w:t>
-      </w:r>
-      <w:proofErr w:type="gramEnd"/>
-      <w:r>
-        <w:t>_status, '')) = '0'</w:t>
-      </w:r>
-    </w:p>
-    <w:p>
-      <w:r>
-        <w:t xml:space="preserve">      AND NULLIF(BTRIM(</w:t>
-      </w:r>
-      <w:proofErr w:type="gramStart"/>
-      <w:r>
-        <w:t>l.device</w:t>
-      </w:r>
-      <w:proofErr w:type="gramEnd"/>
-      <w:r>
-        <w:t>_serial), '') IS NOT NULL</w:t>
+        <w:t xml:space="preserve">    FROM public.legacy_damaged_requisition_forms l</w:t>
+      </w:r>
+    </w:p>
+    <w:p>
+      <w:r>
+        <w:t xml:space="preserve">    WHERE BTRIM(COALESCE(l.legacy_status, '')) = '0'</w:t>
+      </w:r>
+    </w:p>
+    <w:p>
+      <w:r>
+        <w:t xml:space="preserve">      AND NULLIF(BTRIM(l.device_serial), '') IS NOT NULL</w:t>
       </w:r>
     </w:p>
     <w:p/>
@@ -2008,15 +1562,7 @@
     </w:p>
     <w:p>
       <w:r>
-        <w:t xml:space="preserve">    </w:t>
-      </w:r>
-      <w:proofErr w:type="gramStart"/>
-      <w:r>
-        <w:t>ad.asset</w:t>
-      </w:r>
-      <w:proofErr w:type="gramEnd"/>
-      <w:r>
-        <w:t>_status AS existing_asset_status</w:t>
+        <w:t xml:space="preserve">    ad.asset_status AS existing_asset_status</w:t>
       </w:r>
     </w:p>
     <w:p/>
@@ -2027,36 +1573,12 @@
     </w:p>
     <w:p>
       <w:r>
-        <w:t xml:space="preserve">LEFT JOIN </w:t>
-      </w:r>
-      <w:proofErr w:type="gramStart"/>
-      <w:r>
-        <w:t>public.asset</w:t>
-      </w:r>
-      <w:proofErr w:type="gramEnd"/>
-      <w:r>
-        <w:t>_devices ad</w:t>
-      </w:r>
-    </w:p>
-    <w:p>
-      <w:r>
-        <w:t xml:space="preserve">    ON </w:t>
-      </w:r>
-      <w:proofErr w:type="gramStart"/>
-      <w:r>
-        <w:t>ad.device</w:t>
-      </w:r>
-      <w:proofErr w:type="gramEnd"/>
-      <w:r>
-        <w:t xml:space="preserve">_serial_key = </w:t>
-      </w:r>
-      <w:proofErr w:type="gramStart"/>
-      <w:r>
-        <w:t>l.normalized</w:t>
-      </w:r>
-      <w:proofErr w:type="gramEnd"/>
-      <w:r>
-        <w:t>_serial</w:t>
+        <w:t>LEFT JOIN public.asset_devices ad</w:t>
+      </w:r>
+    </w:p>
+    <w:p>
+      <w:r>
+        <w:t xml:space="preserve">    ON ad.device_serial_key = l.normalized_serial</w:t>
       </w:r>
     </w:p>
     <w:p/>
@@ -2098,6 +1620,9 @@
     <w:p/>
     <w:p>
       <w:r>
+        <w:rPr>
+          <w:noProof/>
+        </w:rPr>
         <w:lastRenderedPageBreak/>
         <w:drawing>
           <wp:inline distT="0" distB="0" distL="0" distR="0" wp14:anchorId="6C31BF55" wp14:editId="206436E9">
@@ -2391,7 +1916,7 @@
     <w:p>
       <w:r>
         <w:pict w14:anchorId="02B5C99D">
-          <v:rect id="_x0000_i1055" style="width:0;height:1.5pt" o:hralign="center" o:hrstd="t" o:hr="t" fillcolor="#a0a0a0" stroked="f"/>
+          <v:rect id="_x0000_i1025" style="width:0;height:1.5pt" o:hralign="center" o:hrstd="t" o:hr="t" fillcolor="#a0a0a0" stroked="f"/>
         </w:pict>
       </w:r>
     </w:p>
@@ -2557,27 +2082,11 @@
       </w:r>
       <w:r>
         <w:br/>
-        <w:t xml:space="preserve">    </w:t>
-      </w:r>
-      <w:proofErr w:type="gramStart"/>
-      <w:r>
-        <w:t>COUNT(</w:t>
-      </w:r>
-      <w:proofErr w:type="gramEnd"/>
-      <w:r>
-        <w:t>*) AS backed_up_asset_rows</w:t>
-      </w:r>
-      <w:r>
-        <w:br/>
-        <w:t xml:space="preserve">FROM </w:t>
-      </w:r>
-      <w:proofErr w:type="gramStart"/>
-      <w:r>
-        <w:t>public.backup</w:t>
-      </w:r>
-      <w:proofErr w:type="gramEnd"/>
-      <w:r>
-        <w:t>_asset_devices_before_legacy_status0_damage_20260702;</w:t>
+        <w:t xml:space="preserve">    COUNT(*) AS backed_up_asset_rows</w:t>
+      </w:r>
+      <w:r>
+        <w:br/>
+        <w:t>FROM public.backup_asset_devices_before_legacy_status0_damage_20260702;</w:t>
       </w:r>
     </w:p>
     <w:p>
@@ -2588,7 +2097,7 @@
     <w:p>
       <w:r>
         <w:pict w14:anchorId="13043EC4">
-          <v:rect id="_x0000_i1056" style="width:0;height:1.5pt" o:hralign="center" o:hrstd="t" o:hr="t" fillcolor="#a0a0a0" stroked="f"/>
+          <v:rect id="_x0000_i1026" style="width:0;height:1.5pt" o:hralign="center" o:hrstd="t" o:hr="t" fillcolor="#a0a0a0" stroked="f"/>
         </w:pict>
       </w:r>
     </w:p>
@@ -2917,7 +2426,7 @@
     <w:p>
       <w:r>
         <w:pict w14:anchorId="24E8978F">
-          <v:rect id="_x0000_i1057" style="width:0;height:1.5pt" o:hralign="center" o:hrstd="t" o:hr="t" fillcolor="#a0a0a0" stroked="f"/>
+          <v:rect id="_x0000_i1027" style="width:0;height:1.5pt" o:hralign="center" o:hrstd="t" o:hr="t" fillcolor="#a0a0a0" stroked="f"/>
         </w:pict>
       </w:r>
     </w:p>
@@ -3195,15 +2704,7 @@
     </w:p>
     <w:p>
       <w:r>
-        <w:t>asset_</w:t>
-      </w:r>
-      <w:proofErr w:type="gramStart"/>
-      <w:r>
-        <w:t>devices.device</w:t>
-      </w:r>
-      <w:proofErr w:type="gramEnd"/>
-      <w:r>
-        <w:t>_serial_key</w:t>
+        <w:t>asset_devices.device_serial_key</w:t>
       </w:r>
       <w:r>
         <w:br/>
@@ -3217,7 +2718,7 @@
     <w:p>
       <w:r>
         <w:pict w14:anchorId="0A0B15D4">
-          <v:rect id="_x0000_i1058" style="width:0;height:1.5pt" o:hralign="center" o:hrstd="t" o:hr="t" fillcolor="#a0a0a0" stroked="f"/>
+          <v:rect id="_x0000_i1028" style="width:0;height:1.5pt" o:hralign="center" o:hrstd="t" o:hr="t" fillcolor="#a0a0a0" stroked="f"/>
         </w:pict>
       </w:r>
     </w:p>
@@ -3275,15 +2776,7 @@
       </w:r>
       <w:r>
         <w:br/>
-        <w:t xml:space="preserve">FROM </w:t>
-      </w:r>
-      <w:proofErr w:type="gramStart"/>
-      <w:r>
-        <w:t>public.asset</w:t>
-      </w:r>
-      <w:proofErr w:type="gramEnd"/>
-      <w:r>
-        <w:t>_devices</w:t>
+        <w:t>FROM public.asset_devices</w:t>
       </w:r>
       <w:r>
         <w:br/>
@@ -3325,7 +2818,7 @@
     <w:p>
       <w:r>
         <w:pict w14:anchorId="6651276D">
-          <v:rect id="_x0000_i1059" style="width:0;height:1.5pt" o:hralign="center" o:hrstd="t" o:hr="t" fillcolor="#a0a0a0" stroked="f"/>
+          <v:rect id="_x0000_i1029" style="width:0;height:1.5pt" o:hralign="center" o:hrstd="t" o:hr="t" fillcolor="#a0a0a0" stroked="f"/>
         </w:pict>
       </w:r>
     </w:p>
@@ -3347,27 +2840,11 @@
     </w:p>
     <w:p>
       <w:r>
-        <w:t>gofmt -</w:t>
-      </w:r>
-      <w:proofErr w:type="gramStart"/>
-      <w:r>
-        <w:t>w .</w:t>
-      </w:r>
-      <w:proofErr w:type="gramEnd"/>
-      <w:r>
-        <w:t>\internal\handler\asset_device.go</w:t>
-      </w:r>
-      <w:r>
-        <w:br/>
-        <w:t xml:space="preserve">go </w:t>
-      </w:r>
-      <w:proofErr w:type="gramStart"/>
-      <w:r>
-        <w:t>run .</w:t>
-      </w:r>
-      <w:proofErr w:type="gramEnd"/>
-      <w:r>
-        <w:t>/cmd/server</w:t>
+        <w:t>gofmt -w .\internal\handler\asset_device.go</w:t>
+      </w:r>
+      <w:r>
+        <w:br/>
+        <w:t>go run ./cmd/server</w:t>
       </w:r>
     </w:p>
     <w:p>
@@ -3418,6 +2895,262 @@
       </w:r>
     </w:p>
     <w:p/>
+    <w:p>
+      <w:r>
+        <w:t>-------------------------------------------------------------------------------------------------------------</w:t>
+      </w:r>
+    </w:p>
+    <w:p>
+      <w:r>
+        <w:t>SELECT</w:t>
+      </w:r>
+    </w:p>
+    <w:p>
+      <w:r>
+        <w:t xml:space="preserve">    COUNT(*) FILTER (WHERE owst_category = 1) AS user_ownership,</w:t>
+      </w:r>
+    </w:p>
+    <w:p>
+      <w:r>
+        <w:t xml:space="preserve">    COUNT(*) FILTER (WHERE owst_category = 2) AS vendor_ownership,</w:t>
+      </w:r>
+    </w:p>
+    <w:p>
+      <w:r>
+        <w:t xml:space="preserve">    COUNT(*) FILTER (WHERE owst_category IN (1, 2)) AS total_ownership</w:t>
+      </w:r>
+    </w:p>
+    <w:p>
+      <w:r>
+        <w:t>FROM public.ownership_transfers;</w:t>
+      </w:r>
+    </w:p>
+    <w:p>
+      <w:r>
+        <w:drawing>
+          <wp:inline distT="0" distB="0" distL="0" distR="0" wp14:anchorId="2E3A5EC2" wp14:editId="17126AEB">
+            <wp:extent cx="5943600" cy="2179320"/>
+            <wp:effectExtent l="0" t="0" r="0" b="0"/>
+            <wp:docPr id="1046669769" name="Picture 1"/>
+            <wp:cNvGraphicFramePr>
+              <a:graphicFrameLocks xmlns:a="http://schemas.openxmlformats.org/drawingml/2006/main" noChangeAspect="1"/>
+            </wp:cNvGraphicFramePr>
+            <a:graphic xmlns:a="http://schemas.openxmlformats.org/drawingml/2006/main">
+              <a:graphicData uri="http://schemas.openxmlformats.org/drawingml/2006/picture">
+                <pic:pic xmlns:pic="http://schemas.openxmlformats.org/drawingml/2006/picture">
+                  <pic:nvPicPr>
+                    <pic:cNvPr id="1046669769" name=""/>
+                    <pic:cNvPicPr/>
+                  </pic:nvPicPr>
+                  <pic:blipFill>
+                    <a:blip r:embed="rId13"/>
+                    <a:stretch>
+                      <a:fillRect/>
+                    </a:stretch>
+                  </pic:blipFill>
+                  <pic:spPr>
+                    <a:xfrm>
+                      <a:off x="0" y="0"/>
+                      <a:ext cx="5943600" cy="2179320"/>
+                    </a:xfrm>
+                    <a:prstGeom prst="rect">
+                      <a:avLst/>
+                    </a:prstGeom>
+                  </pic:spPr>
+                </pic:pic>
+              </a:graphicData>
+            </a:graphic>
+          </wp:inline>
+        </w:drawing>
+      </w:r>
+    </w:p>
+    <w:p>
+      <w:pPr>
+        <w:pBdr>
+          <w:bottom w:val="single" w:sz="6" w:space="1" w:color="auto"/>
+        </w:pBdr>
+      </w:pPr>
+    </w:p>
+    <w:p/>
+    <w:p>
+      <w:r>
+        <w:t>SELECT</w:t>
+      </w:r>
+    </w:p>
+    <w:p>
+      <w:r>
+        <w:t xml:space="preserve">    id,</w:t>
+      </w:r>
+    </w:p>
+    <w:p>
+      <w:r>
+        <w:t xml:space="preserve">    device_serial,</w:t>
+      </w:r>
+    </w:p>
+    <w:p>
+      <w:r>
+        <w:t xml:space="preserve">    emp_id,</w:t>
+      </w:r>
+    </w:p>
+    <w:p>
+      <w:r>
+        <w:t xml:space="preserve">    emp_name,</w:t>
+      </w:r>
+    </w:p>
+    <w:p>
+      <w:r>
+        <w:t xml:space="preserve">    department,</w:t>
+      </w:r>
+    </w:p>
+    <w:p>
+      <w:r>
+        <w:t xml:space="preserve">    designation,</w:t>
+      </w:r>
+    </w:p>
+    <w:p>
+      <w:r>
+        <w:t xml:space="preserve">    asset_status</w:t>
+      </w:r>
+    </w:p>
+    <w:p>
+      <w:r>
+        <w:t>FROM public.asset_devices</w:t>
+      </w:r>
+    </w:p>
+    <w:p>
+      <w:r>
+        <w:t>WHERE asset_status = 8</w:t>
+      </w:r>
+    </w:p>
+    <w:p>
+      <w:r>
+        <w:t xml:space="preserve">  AND row_status = 1</w:t>
+      </w:r>
+    </w:p>
+    <w:p>
+      <w:r>
+        <w:t>ORDER BY id DESC;</w:t>
+      </w:r>
+    </w:p>
+    <w:p/>
+    <w:p>
+      <w:r>
+        <w:drawing>
+          <wp:inline distT="0" distB="0" distL="0" distR="0" wp14:anchorId="46B378B8" wp14:editId="00E0A7A3">
+            <wp:extent cx="5943600" cy="3060065"/>
+            <wp:effectExtent l="0" t="0" r="0" b="6985"/>
+            <wp:docPr id="800691027" name="Picture 1"/>
+            <wp:cNvGraphicFramePr>
+              <a:graphicFrameLocks xmlns:a="http://schemas.openxmlformats.org/drawingml/2006/main" noChangeAspect="1"/>
+            </wp:cNvGraphicFramePr>
+            <a:graphic xmlns:a="http://schemas.openxmlformats.org/drawingml/2006/main">
+              <a:graphicData uri="http://schemas.openxmlformats.org/drawingml/2006/picture">
+                <pic:pic xmlns:pic="http://schemas.openxmlformats.org/drawingml/2006/picture">
+                  <pic:nvPicPr>
+                    <pic:cNvPr id="800691027" name=""/>
+                    <pic:cNvPicPr/>
+                  </pic:nvPicPr>
+                  <pic:blipFill>
+                    <a:blip r:embed="rId14"/>
+                    <a:stretch>
+                      <a:fillRect/>
+                    </a:stretch>
+                  </pic:blipFill>
+                  <pic:spPr>
+                    <a:xfrm>
+                      <a:off x="0" y="0"/>
+                      <a:ext cx="5943600" cy="3060065"/>
+                    </a:xfrm>
+                    <a:prstGeom prst="rect">
+                      <a:avLst/>
+                    </a:prstGeom>
+                  </pic:spPr>
+                </pic:pic>
+              </a:graphicData>
+            </a:graphic>
+          </wp:inline>
+        </w:drawing>
+      </w:r>
+    </w:p>
+    <w:p/>
+    <w:p/>
+    <w:p/>
+    <w:p>
+      <w:r>
+        <w:t>SELECT</w:t>
+      </w:r>
+    </w:p>
+    <w:p>
+      <w:r>
+        <w:t xml:space="preserve">    owst_category,</w:t>
+      </w:r>
+    </w:p>
+    <w:p>
+      <w:r>
+        <w:t xml:space="preserve">    COUNT(*) AS total</w:t>
+      </w:r>
+    </w:p>
+    <w:p>
+      <w:r>
+        <w:t>FROM public.ownership_transfers</w:t>
+      </w:r>
+    </w:p>
+    <w:p>
+      <w:r>
+        <w:t>WHERE owst_category IN (1, 2)</w:t>
+      </w:r>
+    </w:p>
+    <w:p>
+      <w:r>
+        <w:t>GROUP BY owst_category</w:t>
+      </w:r>
+    </w:p>
+    <w:p>
+      <w:r>
+        <w:t>ORDER BY owst_category;</w:t>
+      </w:r>
+    </w:p>
+    <w:p/>
+    <w:p/>
+    <w:p>
+      <w:r>
+        <w:drawing>
+          <wp:inline distT="0" distB="0" distL="0" distR="0" wp14:anchorId="66116B97" wp14:editId="0724718A">
+            <wp:extent cx="5943600" cy="3165475"/>
+            <wp:effectExtent l="0" t="0" r="0" b="0"/>
+            <wp:docPr id="694584352" name="Picture 1"/>
+            <wp:cNvGraphicFramePr>
+              <a:graphicFrameLocks xmlns:a="http://schemas.openxmlformats.org/drawingml/2006/main" noChangeAspect="1"/>
+            </wp:cNvGraphicFramePr>
+            <a:graphic xmlns:a="http://schemas.openxmlformats.org/drawingml/2006/main">
+              <a:graphicData uri="http://schemas.openxmlformats.org/drawingml/2006/picture">
+                <pic:pic xmlns:pic="http://schemas.openxmlformats.org/drawingml/2006/picture">
+                  <pic:nvPicPr>
+                    <pic:cNvPr id="694584352" name=""/>
+                    <pic:cNvPicPr/>
+                  </pic:nvPicPr>
+                  <pic:blipFill>
+                    <a:blip r:embed="rId15"/>
+                    <a:stretch>
+                      <a:fillRect/>
+                    </a:stretch>
+                  </pic:blipFill>
+                  <pic:spPr>
+                    <a:xfrm>
+                      <a:off x="0" y="0"/>
+                      <a:ext cx="5943600" cy="3165475"/>
+                    </a:xfrm>
+                    <a:prstGeom prst="rect">
+                      <a:avLst/>
+                    </a:prstGeom>
+                  </pic:spPr>
+                </pic:pic>
+              </a:graphicData>
+            </a:graphic>
+          </wp:inline>
+        </w:drawing>
+      </w:r>
+    </w:p>
     <w:sectPr>
       <w:pgSz w:w="12240" w:h="15840"/>
       <w:pgMar w:top="1440" w:right="1440" w:bottom="1440" w:left="1440" w:header="720" w:footer="720" w:gutter="0"/>
@@ -4031,6 +3764,7 @@
   <w:style w:type="character" w:default="1" w:styleId="DefaultParagraphFont">
     <w:name w:val="Default Paragraph Font"/>
     <w:uiPriority w:val="1"/>
+    <w:semiHidden/>
     <w:unhideWhenUsed/>
   </w:style>
   <w:style w:type="table" w:default="1" w:styleId="TableNormal">

</xml_diff>